<commit_message>
Fix AIAutomation dates and add Red Sky CV package
Co-authored-by: Maciej <WeaverTech@users.noreply.github.com>
</commit_message>
<xml_diff>
--- a/artifacts/softserve-cv/Maciej_Tkacz_CV_SoftServe_EN_ATS.docx
+++ b/artifacts/softserve-cv/Maciej_Tkacz_CV_SoftServe_EN_ATS.docx
@@ -34,7 +34,7 @@
         <w:rPr>
           <w:sz w:val="16"/>
         </w:rPr>
-        <w:t>Email: maciek01110@gmail.com | Phone: +48 881 912 125 | Location: Krakow, Poland | English: C1 | Driving licence: category B</w:t>
+        <w:t>Email: maciek01110@gmail.com | Phone: +48 881 912 125 | Location: Krakow, Poland | Polish: native | English: C1 | Driving licence: category B</w:t>
       </w:r>
     </w:p>
     <w:p>
@@ -125,7 +125,7 @@
         <w:ind w:left="198"/>
       </w:pPr>
       <w:r>
-        <w:t>Hardware-software integration: stepper motors, motor drivers, microcontroller/single-board platforms, wiring, testing and iterative debugging of electromechanical prototypes.</w:t>
+        <w:t>Hardware-software integration: NEMA stepper motors, TMC/DRV motor drivers, Arduino/ESP32-class microcontroller and single-board platforms, wiring, testing and iterative debugging of electromechanical prototypes.</w:t>
       </w:r>
     </w:p>
     <w:p>
@@ -166,7 +166,7 @@
         <w:ind w:left="198"/>
       </w:pPr>
       <w:r>
-        <w:t>Designed and built an end-to-end SCARA robotic arm prototype, covering mechanical concept, CAD modelling, kinematic layout, actuator/driver selection, electronics and wiring.</w:t>
+        <w:t>Designed and built an end-to-end SCARA robotic arm prototype, covering mechanical concept, CAD modelling, kinematic layout, selection of NEMA stepper actuators and TMC/DRV drivers, microcontroller electronics and wiring.</w:t>
       </w:r>
     </w:p>
     <w:p>
@@ -223,7 +223,7 @@
         <w:t>Application Engineer</w:t>
       </w:r>
       <w:r>
-        <w:t xml:space="preserve"> | AIAutomation | Aug 2025 - May 2026</w:t>
+        <w:t xml:space="preserve"> | AIAutomation | Jan 2025 - May 2026</w:t>
       </w:r>
     </w:p>
     <w:p>

</xml_diff>